<commit_message>
Enhance Auto-Doc template with text styling options
Added support for bold, underline, and italic text styles in the Auto-Doc template. The changes include new directives for formatting placeholders, updates to the rendering engine to apply these styles, and tests to ensure correct functionality. The user guide has also been updated to reflect these new features, providing clearer instructions on how to use the text styling options.
</commit_message>
<xml_diff>
--- a/apps/web/public/downloads/openlaw-auto-doc-starter.docx
+++ b/apps/web/public/downloads/openlaw-auto-doc-starter.docx
@@ -101,6 +101,90 @@
               <w:pStyle w:val="Code"/>
             </w:pPr>
             <w:r>
+              <w:t xml:space="preserve">{{client_name|bold}}</w:t>
+            </w:r>
+          </w:p>
+        </w:tc>
+        <w:tc>
+          <w:tcPr>
+            <w:tcW w:w="4138" w:type="dxa"/>
+          </w:tcPr>
+          <w:p>
+            <w:pPr>
+              <w:pStyle w:val="Guide"/>
+            </w:pPr>
+            <w:r>
+              <w:t xml:space="preserve">Makes the name bold</w:t>
+            </w:r>
+          </w:p>
+        </w:tc>
+      </w:tr>
+      <w:tr>
+        <w:tc>
+          <w:tcPr>
+            <w:tcW w:w="5500" w:type="dxa"/>
+          </w:tcPr>
+          <w:p>
+            <w:pPr>
+              <w:pStyle w:val="Code"/>
+            </w:pPr>
+            <w:r>
+              <w:t xml:space="preserve">{{client_name|underline}}</w:t>
+            </w:r>
+          </w:p>
+        </w:tc>
+        <w:tc>
+          <w:tcPr>
+            <w:tcW w:w="4138" w:type="dxa"/>
+          </w:tcPr>
+          <w:p>
+            <w:pPr>
+              <w:pStyle w:val="Guide"/>
+            </w:pPr>
+            <w:r>
+              <w:t xml:space="preserve">Underlines the name</w:t>
+            </w:r>
+          </w:p>
+        </w:tc>
+      </w:tr>
+      <w:tr>
+        <w:tc>
+          <w:tcPr>
+            <w:tcW w:w="5500" w:type="dxa"/>
+          </w:tcPr>
+          <w:p>
+            <w:pPr>
+              <w:pStyle w:val="Code"/>
+            </w:pPr>
+            <w:r>
+              <w:t xml:space="preserve">{{client_name|italic}}</w:t>
+            </w:r>
+          </w:p>
+        </w:tc>
+        <w:tc>
+          <w:tcPr>
+            <w:tcW w:w="4138" w:type="dxa"/>
+          </w:tcPr>
+          <w:p>
+            <w:pPr>
+              <w:pStyle w:val="Guide"/>
+            </w:pPr>
+            <w:r>
+              <w:t xml:space="preserve">Makes the name italic</w:t>
+            </w:r>
+          </w:p>
+        </w:tc>
+      </w:tr>
+      <w:tr>
+        <w:tc>
+          <w:tcPr>
+            <w:tcW w:w="5500" w:type="dxa"/>
+          </w:tcPr>
+          <w:p>
+            <w:pPr>
+              <w:pStyle w:val="Code"/>
+            </w:pPr>
+            <w:r>
               <w:t xml:space="preserve">{{client_name|upper}}</w:t>
             </w:r>
           </w:p>
@@ -338,7 +422,7 @@
         <w:pStyle w:val="Normal"/>
       </w:pPr>
       <w:r>
-        <w:t xml:space="preserve">The Provider shall perform the following services for the Client: {{services}}</w:t>
+        <w:t xml:space="preserve">The Provider shall perform the following services for the Client: {{services|italic}}</w:t>
       </w:r>
     </w:p>
     <w:p>
@@ -448,7 +532,7 @@
               <w:pStyle w:val="Heading2"/>
             </w:pPr>
             <w:r>
-              <w:t xml:space="preserve">For {{provider_name}}</w:t>
+              <w:t xml:space="preserve">For {{provider_name|bold}}</w:t>
             </w:r>
           </w:p>
           <w:p>
@@ -485,7 +569,7 @@
               <w:pStyle w:val="Heading2"/>
             </w:pPr>
             <w:r>
-              <w:t xml:space="preserve">For {{client_name}}</w:t>
+              <w:t xml:space="preserve">For {{client_name|underline}}</w:t>
             </w:r>
           </w:p>
           <w:p>

</xml_diff>